<commit_message>
Deploy preview for PR 109 🛫
</commit_message>
<xml_diff>
--- a/pr-preview/pr-109/chapters/08-selection-bias-tracked-changes.docx
+++ b/pr-preview/pr-109/chapters/08-selection-bias-tracked-changes.docx
@@ -2366,13 +2366,13 @@
               <w:t xml:space="preserve"> (Direction of the bias from loss to follow-up). </w:t>
             </w:r>
             <w:r>
-              <w:t xml:space="preserve">Intuition for the direction of the bias: a treated individual with side effects is at higher risk of dropping out.</w:t>
-            </w:r>
-            <w:r>
-              <w:t xml:space="preserve"> </w:t>
-            </w:r>
-            <w:r>
-              <w:t xml:space="preserve">If that individual nevertheless did not drop out (</w:t>
+              <w:t xml:space="preserve">Intuition for one possible direction: side effects of treatment push treated individuals toward dropping out.</w:t>
+            </w:r>
+            <w:r>
+              <w:t xml:space="preserve"> </w:t>
+            </w:r>
+            <w:r>
+              <w:t xml:space="preserve">A treated individual who stayed in the study (</w:t>
             </w:r>
             <m:oMath>
               <m:r>
@@ -2389,7 +2389,13 @@
               </m:r>
             </m:oMath>
             <w:r>
-              <w:t xml:space="preserve">), a second, independent cause of dropout (such as</w:t>
+              <w:t xml:space="preserve">) stayed despite that push,</w:t>
+            </w:r>
+            <w:r>
+              <w:t xml:space="preserve"> </w:t>
+            </w:r>
+            <w:r>
+              <w:t xml:space="preserve">which makes it less likely that they also had another cause of dropout, such as</w:t>
             </w:r>
             <w:r>
               <w:t xml:space="preserve"> </w:t>
@@ -2409,13 +2415,42 @@
               </m:r>
             </m:oMath>
             <w:r>
-              <w:t xml:space="preserve">) is less likely to be present.</w:t>
-            </w:r>
-            <w:r>
-              <w:t xml:space="preserve"> </w:t>
-            </w:r>
-            <w:r>
-              <w:t xml:space="preserve">So among the uncensored,</w:t>
+              <w:t xml:space="preserve">.</w:t>
+            </w:r>
+            <w:r>
+              <w:t xml:space="preserve"> </w:t>
+            </w:r>
+            <w:r>
+              <w:t xml:space="preserve">So among those who stayed, the treated may carry</w:t>
+            </w:r>
+            <w:r>
+              <w:t xml:space="preserve"> </w:t>
+            </w:r>
+            <m:oMath>
+              <m:r>
+                <m:t>U</m:t>
+              </m:r>
+              <m:r>
+                <m:rPr>
+                  <m:sty m:val="p"/>
+                </m:rPr>
+                <m:t>=</m:t>
+              </m:r>
+              <m:r>
+                <m:t>1</m:t>
+              </m:r>
+            </m:oMath>
+            <w:r>
+              <w:t xml:space="preserve"> </w:t>
+            </w:r>
+            <w:r>
+              <w:t xml:space="preserve">less often than the untreated.</w:t>
+            </w:r>
+            <w:r>
+              <w:t xml:space="preserve"> </w:t>
+            </w:r>
+            <w:r>
+              <w:t xml:space="preserve">That intuition suggests that</w:t>
             </w:r>
             <w:r>
               <w:t xml:space="preserve"> </w:t>
@@ -2443,19 +2478,13 @@
               <w:t xml:space="preserve"> </w:t>
             </w:r>
             <w:r>
-              <w:t xml:space="preserve">are generically (under faithfulness) inversely associated,</w:t>
-            </w:r>
-            <w:r>
-              <w:t xml:space="preserve"> </w:t>
-            </w:r>
-            <w:r>
-              <w:t xml:space="preserve">assuming both raise the risk of dropout (rather than one raising it and the other lowering it).</w:t>
-            </w:r>
-            <w:r>
-              <w:t xml:space="preserve"> </w:t>
-            </w:r>
-            <w:r>
-              <w:t xml:space="preserve">Because</w:t>
+              <w:t xml:space="preserve">are inversely associated among the uncensored,</w:t>
+            </w:r>
+            <w:r>
+              <w:t xml:space="preserve"> </w:t>
+            </w:r>
+            <w:r>
+              <w:t xml:space="preserve">and so, because</w:t>
             </w:r>
             <w:r>
               <w:t xml:space="preserve"> </w:t>
@@ -2486,7 +2515,7 @@
               <w:t xml:space="preserve"> </w:t>
             </w:r>
             <w:r>
-              <w:t xml:space="preserve">restricting to the uncensored generically (under faithfulness) induces an inverse association between</w:t>
+              <w:t xml:space="preserve">that restricting to the uncensored induces an inverse association between</w:t>
             </w:r>
             <w:r>
               <w:t xml:space="preserve"> </w:t>
@@ -2512,6 +2541,249 @@
             </m:oMath>
             <w:r>
               <w:t xml:space="preserve">.</w:t>
+            </w:r>
+          </w:p>
+          <w:p>
+            <w:pPr>
+              <w:pStyle w:val="BodyText"/>
+            </w:pPr>
+            <w:r>
+              <w:t xml:space="preserve">The diagram alone does not fix this sign.</w:t>
+            </w:r>
+            <w:r>
+              <w:t xml:space="preserve"> </w:t>
+            </w:r>
+            <w:r>
+              <w:t xml:space="preserve">Faithfulness says only that</w:t>
+            </w:r>
+            <w:r>
+              <w:t xml:space="preserve"> </w:t>
+            </w:r>
+            <m:oMath>
+              <m:r>
+                <m:t>A</m:t>
+              </m:r>
+            </m:oMath>
+            <w:r>
+              <w:t xml:space="preserve"> </w:t>
+            </w:r>
+            <w:r>
+              <w:t xml:space="preserve">and</w:t>
+            </w:r>
+            <w:r>
+              <w:t xml:space="preserve"> </w:t>
+            </w:r>
+            <m:oMath>
+              <m:r>
+                <m:t>U</m:t>
+              </m:r>
+            </m:oMath>
+            <w:r>
+              <w:t xml:space="preserve"> </w:t>
+            </w:r>
+            <w:r>
+              <w:t xml:space="preserve">are dependent in at least one level of</w:t>
+            </w:r>
+            <w:r>
+              <w:t xml:space="preserve"> </w:t>
+            </w:r>
+            <m:oMath>
+              <m:r>
+                <m:t>C</m:t>
+              </m:r>
+            </m:oMath>
+            <w:r>
+              <w:t xml:space="preserve">;</w:t>
+            </w:r>
+            <w:r>
+              <w:t xml:space="preserve"> </w:t>
+            </w:r>
+            <w:r>
+              <w:t xml:space="preserve">it says nothing about a single stratum such as</w:t>
+            </w:r>
+            <w:r>
+              <w:t xml:space="preserve"> </w:t>
+            </w:r>
+            <m:oMath>
+              <m:r>
+                <m:t>C</m:t>
+              </m:r>
+              <m:r>
+                <m:rPr>
+                  <m:sty m:val="p"/>
+                </m:rPr>
+                <m:t>=</m:t>
+              </m:r>
+              <m:r>
+                <m:t>0</m:t>
+              </m:r>
+            </m:oMath>
+            <w:r>
+              <w:t xml:space="preserve">.</w:t>
+            </w:r>
+            <w:r>
+              <w:t xml:space="preserve"> </w:t>
+            </w:r>
+            <w:r>
+              <w:t xml:space="preserve">The sign, and even whether the uncensored stratum carries any association,</w:t>
+            </w:r>
+            <w:r>
+              <w:t xml:space="preserve"> </w:t>
+            </w:r>
+            <w:r>
+              <w:t xml:space="preserve">depends on how</w:t>
+            </w:r>
+            <w:r>
+              <w:t xml:space="preserve"> </w:t>
+            </w:r>
+            <m:oMath>
+              <m:r>
+                <m:t>A</m:t>
+              </m:r>
+            </m:oMath>
+            <w:r>
+              <w:t xml:space="preserve"> </w:t>
+            </w:r>
+            <w:r>
+              <w:t xml:space="preserve">and</w:t>
+            </w:r>
+            <w:r>
+              <w:t xml:space="preserve"> </w:t>
+            </w:r>
+            <m:oMath>
+              <m:r>
+                <m:t>U</m:t>
+              </m:r>
+            </m:oMath>
+            <w:r>
+              <w:t xml:space="preserve"> </w:t>
+            </w:r>
+            <w:r>
+              <w:t xml:space="preserve">act together on dropout.</w:t>
+            </w:r>
+            <w:r>
+              <w:t xml:space="preserve"> </w:t>
+            </w:r>
+            <w:r>
+              <w:t xml:space="preserve">For instance, if</w:t>
+            </w:r>
+            <w:r>
+              <w:t xml:space="preserve"> </w:t>
+            </w:r>
+            <m:oMath>
+              <m:r>
+                <m:rPr>
+                  <m:sty m:val="p"/>
+                </m:rPr>
+                <m:t>Pr</m:t>
+              </m:r>
+              <m:r>
+                <m:rPr>
+                  <m:sty m:val="p"/>
+                </m:rPr>
+                <m:t>[</m:t>
+              </m:r>
+              <m:r>
+                <m:t>C</m:t>
+              </m:r>
+              <m:r>
+                <m:rPr>
+                  <m:sty m:val="p"/>
+                </m:rPr>
+                <m:t>=</m:t>
+              </m:r>
+              <m:r>
+                <m:t>0</m:t>
+              </m:r>
+              <m:r>
+                <m:rPr>
+                  <m:sty m:val="p"/>
+                </m:rPr>
+                <m:t>∣</m:t>
+              </m:r>
+              <m:r>
+                <m:t>A</m:t>
+              </m:r>
+              <m:r>
+                <m:rPr>
+                  <m:sty m:val="p"/>
+                </m:rPr>
+                <m:t>,</m:t>
+              </m:r>
+              <m:r>
+                <m:t>U</m:t>
+              </m:r>
+              <m:r>
+                <m:rPr>
+                  <m:sty m:val="p"/>
+                </m:rPr>
+                <m:t>]</m:t>
+              </m:r>
+            </m:oMath>
+            <w:r>
+              <w:t xml:space="preserve"> </w:t>
+            </w:r>
+            <w:r>
+              <w:t xml:space="preserve">is a function of</w:t>
+            </w:r>
+            <w:r>
+              <w:t xml:space="preserve"> </w:t>
+            </w:r>
+            <m:oMath>
+              <m:r>
+                <m:t>A</m:t>
+              </m:r>
+            </m:oMath>
+            <w:r>
+              <w:t xml:space="preserve"> </w:t>
+            </w:r>
+            <w:r>
+              <w:t xml:space="preserve">times a function of</w:t>
+            </w:r>
+            <w:r>
+              <w:t xml:space="preserve"> </w:t>
+            </w:r>
+            <m:oMath>
+              <m:r>
+                <m:t>U</m:t>
+              </m:r>
+            </m:oMath>
+            <w:r>
+              <w:t xml:space="preserve">,</w:t>
+            </w:r>
+            <w:r>
+              <w:t xml:space="preserve"> </w:t>
+            </w:r>
+            <w:r>
+              <w:t xml:space="preserve">then</w:t>
+            </w:r>
+            <w:r>
+              <w:t xml:space="preserve"> </w:t>
+            </w:r>
+            <m:oMath>
+              <m:r>
+                <m:t>A</m:t>
+              </m:r>
+            </m:oMath>
+            <w:r>
+              <w:t xml:space="preserve"> </w:t>
+            </w:r>
+            <w:r>
+              <w:t xml:space="preserve">and</w:t>
+            </w:r>
+            <w:r>
+              <w:t xml:space="preserve"> </w:t>
+            </w:r>
+            <m:oMath>
+              <m:r>
+                <m:t>U</m:t>
+              </m:r>
+            </m:oMath>
+            <w:r>
+              <w:t xml:space="preserve"> </w:t>
+            </w:r>
+            <w:r>
+              <w:t xml:space="preserve">stay independent among the uncensored.</w:t>
             </w:r>
           </w:p>
           <w:bookmarkEnd w:id="19"/>
@@ -7036,7 +7308,7 @@
               <w:t xml:space="preserve"> </w:t>
             </w:r>
             <w:r>
-              <w:t xml:space="preserve">So among time-1 survivors,</w:t>
+              <w:t xml:space="preserve">That suggests</w:t>
             </w:r>
             <w:r>
               <w:t xml:space="preserve"> </w:t>
@@ -7050,56 +7322,42 @@
               <w:t xml:space="preserve"> </w:t>
             </w:r>
             <w:r>
-              <w:t xml:space="preserve">is generically (under faithfulness) rarer in the treated arm,</w:t>
-            </w:r>
-            <w:r>
-              <w:t xml:space="preserve"> </w:t>
-            </w:r>
-            <w:r>
-              <w:t xml:space="preserve">given that both</w:t>
-            </w:r>
-            <w:r>
-              <w:t xml:space="preserve"> </w:t>
-            </w:r>
-            <m:oMath>
-              <m:r>
-                <m:t>U</m:t>
-              </m:r>
-            </m:oMath>
-            <w:r>
-              <w:t xml:space="preserve"> </w:t>
-            </w:r>
-            <w:r>
-              <w:t xml:space="preserve">and the transplant lower the risk of death,</w:t>
-            </w:r>
-            <w:r>
-              <w:t xml:space="preserve"> </w:t>
-            </w:r>
-            <w:r>
-              <w:t xml:space="preserve">which leaves treated survivors at higher risk of death at time 2.</w:t>
-            </w:r>
-            <w:r>
-              <w:t xml:space="preserve"> </w:t>
-            </w:r>
-            <w:r>
-              <w:t xml:space="preserve">In this example, the hazard ratio is below 1 at time 1 and, generically (under faithfulness), above 1 at time 2,</w:t>
-            </w:r>
-            <w:r>
-              <w:t xml:space="preserve"> </w:t>
-            </w:r>
-            <w:r>
-              <w:t xml:space="preserve">so the hazards cross.</w:t>
-            </w:r>
-            <w:r>
-              <w:t xml:space="preserve"> </w:t>
-            </w:r>
-            <w:r>
-              <w:t xml:space="preserve">The time-2 hazard ratio is biased for the (null) direct effect because conditioning on</w:t>
-            </w:r>
-            <w:r>
-              <w:t xml:space="preserve"> </w:t>
-            </w:r>
-            <m:oMath>
+              <w:t xml:space="preserve">is rarer among treated survivors than among untreated survivors,</w:t>
+            </w:r>
+            <w:r>
+              <w:t xml:space="preserve"> </w:t>
+            </w:r>
+            <w:r>
+              <w:t xml:space="preserve">which would leave treated survivors at higher risk of death at time 2.</w:t>
+            </w:r>
+            <w:r>
+              <w:t xml:space="preserve"> </w:t>
+            </w:r>
+            <w:r>
+              <w:t xml:space="preserve">The diagram does not guarantee this sign:</w:t>
+            </w:r>
+            <w:r>
+              <w:t xml:space="preserve"> </w:t>
+            </w:r>
+            <w:r>
+              <w:t xml:space="preserve">if</w:t>
+            </w:r>
+            <w:r>
+              <w:t xml:space="preserve"> </w:t>
+            </w:r>
+            <m:oMath>
+              <m:r>
+                <m:rPr>
+                  <m:sty m:val="p"/>
+                </m:rPr>
+                <m:t>Pr</m:t>
+              </m:r>
+              <m:r>
+                <m:rPr>
+                  <m:sty m:val="p"/>
+                </m:rPr>
+                <m:t>[</m:t>
+              </m:r>
               <m:sSub>
                 <m:e>
                   <m:r>
@@ -7112,17 +7370,84 @@
                   </m:r>
                 </m:sub>
               </m:sSub>
-            </m:oMath>
-            <w:r>
-              <w:t xml:space="preserve">, a common effect of</w:t>
-            </w:r>
-            <w:r>
-              <w:t xml:space="preserve"> </w:t>
-            </w:r>
-            <m:oMath>
+              <m:r>
+                <m:rPr>
+                  <m:sty m:val="p"/>
+                </m:rPr>
+                <m:t>=</m:t>
+              </m:r>
+              <m:r>
+                <m:t>0</m:t>
+              </m:r>
+              <m:r>
+                <m:rPr>
+                  <m:sty m:val="p"/>
+                </m:rPr>
+                <m:t>∣</m:t>
+              </m:r>
               <m:r>
                 <m:t>A</m:t>
               </m:r>
+              <m:r>
+                <m:rPr>
+                  <m:sty m:val="p"/>
+                </m:rPr>
+                <m:t>,</m:t>
+              </m:r>
+              <m:r>
+                <m:t>U</m:t>
+              </m:r>
+              <m:r>
+                <m:rPr>
+                  <m:sty m:val="p"/>
+                </m:rPr>
+                <m:t>]</m:t>
+              </m:r>
+            </m:oMath>
+            <w:r>
+              <w:t xml:space="preserve"> </w:t>
+            </w:r>
+            <w:r>
+              <w:t xml:space="preserve">is a function of</w:t>
+            </w:r>
+            <w:r>
+              <w:t xml:space="preserve"> </w:t>
+            </w:r>
+            <m:oMath>
+              <m:r>
+                <m:t>A</m:t>
+              </m:r>
+            </m:oMath>
+            <w:r>
+              <w:t xml:space="preserve"> </w:t>
+            </w:r>
+            <w:r>
+              <w:t xml:space="preserve">times a function of</w:t>
+            </w:r>
+            <w:r>
+              <w:t xml:space="preserve"> </w:t>
+            </w:r>
+            <m:oMath>
+              <m:r>
+                <m:t>U</m:t>
+              </m:r>
+            </m:oMath>
+            <w:r>
+              <w:t xml:space="preserve">,</w:t>
+            </w:r>
+            <w:r>
+              <w:t xml:space="preserve"> </w:t>
+            </w:r>
+            <w:r>
+              <w:t xml:space="preserve">then</w:t>
+            </w:r>
+            <w:r>
+              <w:t xml:space="preserve"> </w:t>
+            </w:r>
+            <m:oMath>
+              <m:r>
+                <m:t>A</m:t>
+              </m:r>
             </m:oMath>
             <w:r>
               <w:t xml:space="preserve"> </w:t>
@@ -7139,21 +7464,39 @@
               </m:r>
             </m:oMath>
             <w:r>
-              <w:t xml:space="preserve">, opens</w:t>
-            </w:r>
-            <w:r>
-              <w:t xml:space="preserve"> </w:t>
-            </w:r>
-            <m:oMath>
-              <m:r>
-                <m:t>A</m:t>
-              </m:r>
-              <m:r>
-                <m:rPr>
-                  <m:sty m:val="p"/>
-                </m:rPr>
-                <m:t>→</m:t>
-              </m:r>
+              <w:t xml:space="preserve"> </w:t>
+            </w:r>
+            <w:r>
+              <w:t xml:space="preserve">stay independent among time-1 survivors.</w:t>
+            </w:r>
+            <w:r>
+              <w:t xml:space="preserve"> </w:t>
+            </w:r>
+            <w:r>
+              <w:t xml:space="preserve">When the intuition does hold, the hazard ratio is below 1 at time 1 and above 1 at time 2,</w:t>
+            </w:r>
+            <w:r>
+              <w:t xml:space="preserve"> </w:t>
+            </w:r>
+            <w:r>
+              <w:t xml:space="preserve">so the hazards cross.</w:t>
+            </w:r>
+            <w:r>
+              <w:t xml:space="preserve"> </w:t>
+            </w:r>
+            <w:r>
+              <w:t xml:space="preserve">The time-2 hazard ratio is generically (under faithfulness) biased for the (null) direct effect,</w:t>
+            </w:r>
+            <w:r>
+              <w:t xml:space="preserve"> </w:t>
+            </w:r>
+            <w:r>
+              <w:t xml:space="preserve">because conditioning on</w:t>
+            </w:r>
+            <w:r>
+              <w:t xml:space="preserve"> </w:t>
+            </w:r>
+            <m:oMath>
               <m:sSub>
                 <m:e>
                   <m:r>
@@ -7166,6 +7509,60 @@
                   </m:r>
                 </m:sub>
               </m:sSub>
+            </m:oMath>
+            <w:r>
+              <w:t xml:space="preserve">, a common effect of</w:t>
+            </w:r>
+            <w:r>
+              <w:t xml:space="preserve"> </w:t>
+            </w:r>
+            <m:oMath>
+              <m:r>
+                <m:t>A</m:t>
+              </m:r>
+            </m:oMath>
+            <w:r>
+              <w:t xml:space="preserve"> </w:t>
+            </w:r>
+            <w:r>
+              <w:t xml:space="preserve">and</w:t>
+            </w:r>
+            <w:r>
+              <w:t xml:space="preserve"> </w:t>
+            </w:r>
+            <m:oMath>
+              <m:r>
+                <m:t>U</m:t>
+              </m:r>
+            </m:oMath>
+            <w:r>
+              <w:t xml:space="preserve">, opens</w:t>
+            </w:r>
+            <w:r>
+              <w:t xml:space="preserve"> </w:t>
+            </w:r>
+            <m:oMath>
+              <m:r>
+                <m:t>A</m:t>
+              </m:r>
+              <m:r>
+                <m:rPr>
+                  <m:sty m:val="p"/>
+                </m:rPr>
+                <m:t>→</m:t>
+              </m:r>
+              <m:sSub>
+                <m:e>
+                  <m:r>
+                    <m:t>Y</m:t>
+                  </m:r>
+                </m:e>
+                <m:sub>
+                  <m:r>
+                    <m:t>1</m:t>
+                  </m:r>
+                </m:sub>
+              </m:sSub>
               <m:r>
                 <m:rPr>
                   <m:sty m:val="p"/>
@@ -7316,7 +7713,7 @@
               <w:t xml:space="preserve"> </w:t>
             </w:r>
             <w:r>
-              <w:t xml:space="preserve">differs from the ratio within each level of</w:t>
+              <w:t xml:space="preserve">generically (under faithfulness) differs from the ratio within each level of</w:t>
             </w:r>
             <w:r>
               <w:t xml:space="preserve"> </w:t>
@@ -17585,12 +17982,78 @@
               <w:pStyle w:val="FirstParagraph"/>
             </w:pPr>
             <w:r>
-              <w:t xml:space="preserve">can be interpreted as the effect of treatment among the uncensored with</w:t>
-            </w:r>
-            <w:r>
-              <w:t xml:space="preserve"> </w:t>
-            </w:r>
-            <m:oMath>
+              <w:t xml:space="preserve">equals</w:t>
+            </w:r>
+            <w:r>
+              <w:t xml:space="preserve"> </w:t>
+            </w:r>
+            <m:oMath>
+              <m:r>
+                <m:rPr>
+                  <m:sty m:val="p"/>
+                </m:rPr>
+                <m:t>Pr</m:t>
+              </m:r>
+              <m:r>
+                <m:rPr>
+                  <m:sty m:val="p"/>
+                </m:rPr>
+                <m:t>[</m:t>
+              </m:r>
+              <m:sSup>
+                <m:e>
+                  <m:r>
+                    <m:t>Y</m:t>
+                  </m:r>
+                </m:e>
+                <m:sup>
+                  <m:r>
+                    <m:t>a</m:t>
+                  </m:r>
+                  <m:r>
+                    <m:rPr>
+                      <m:sty m:val="p"/>
+                    </m:rPr>
+                    <m:t>=</m:t>
+                  </m:r>
+                  <m:r>
+                    <m:t>1</m:t>
+                  </m:r>
+                  <m:r>
+                    <m:rPr>
+                      <m:sty m:val="p"/>
+                    </m:rPr>
+                    <m:t>,</m:t>
+                  </m:r>
+                  <m:r>
+                    <m:t>c</m:t>
+                  </m:r>
+                  <m:r>
+                    <m:rPr>
+                      <m:sty m:val="p"/>
+                    </m:rPr>
+                    <m:t>=</m:t>
+                  </m:r>
+                  <m:r>
+                    <m:t>0</m:t>
+                  </m:r>
+                </m:sup>
+              </m:sSup>
+              <m:r>
+                <m:rPr>
+                  <m:sty m:val="p"/>
+                </m:rPr>
+                <m:t>=</m:t>
+              </m:r>
+              <m:r>
+                <m:t>1</m:t>
+              </m:r>
+              <m:r>
+                <m:rPr>
+                  <m:sty m:val="p"/>
+                </m:rPr>
+                <m:t>∣</m:t>
+              </m:r>
               <m:r>
                 <m:t>L</m:t>
               </m:r>
@@ -17603,6 +18066,277 @@
               <m:r>
                 <m:t>l</m:t>
               </m:r>
+              <m:r>
+                <m:rPr>
+                  <m:sty m:val="p"/>
+                </m:rPr>
+                <m:t>]</m:t>
+              </m:r>
+              <m:r>
+                <m:rPr>
+                  <m:sty m:val="p"/>
+                </m:rPr>
+                <m:t>/</m:t>
+              </m:r>
+              <m:r>
+                <m:rPr>
+                  <m:sty m:val="p"/>
+                </m:rPr>
+                <m:t>Pr</m:t>
+              </m:r>
+              <m:r>
+                <m:rPr>
+                  <m:sty m:val="p"/>
+                </m:rPr>
+                <m:t>[</m:t>
+              </m:r>
+              <m:sSup>
+                <m:e>
+                  <m:r>
+                    <m:t>Y</m:t>
+                  </m:r>
+                </m:e>
+                <m:sup>
+                  <m:r>
+                    <m:t>a</m:t>
+                  </m:r>
+                  <m:r>
+                    <m:rPr>
+                      <m:sty m:val="p"/>
+                    </m:rPr>
+                    <m:t>=</m:t>
+                  </m:r>
+                  <m:r>
+                    <m:t>0</m:t>
+                  </m:r>
+                  <m:r>
+                    <m:rPr>
+                      <m:sty m:val="p"/>
+                    </m:rPr>
+                    <m:t>,</m:t>
+                  </m:r>
+                  <m:r>
+                    <m:t>c</m:t>
+                  </m:r>
+                  <m:r>
+                    <m:rPr>
+                      <m:sty m:val="p"/>
+                    </m:rPr>
+                    <m:t>=</m:t>
+                  </m:r>
+                  <m:r>
+                    <m:t>0</m:t>
+                  </m:r>
+                </m:sup>
+              </m:sSup>
+              <m:r>
+                <m:rPr>
+                  <m:sty m:val="p"/>
+                </m:rPr>
+                <m:t>=</m:t>
+              </m:r>
+              <m:r>
+                <m:t>1</m:t>
+              </m:r>
+              <m:r>
+                <m:rPr>
+                  <m:sty m:val="p"/>
+                </m:rPr>
+                <m:t>∣</m:t>
+              </m:r>
+              <m:r>
+                <m:t>L</m:t>
+              </m:r>
+              <m:r>
+                <m:rPr>
+                  <m:sty m:val="p"/>
+                </m:rPr>
+                <m:t>=</m:t>
+              </m:r>
+              <m:r>
+                <m:t>l</m:t>
+              </m:r>
+              <m:r>
+                <m:rPr>
+                  <m:sty m:val="p"/>
+                </m:rPr>
+                <m:t>]</m:t>
+              </m:r>
+            </m:oMath>
+            <w:r>
+              <w:t xml:space="preserve">,</w:t>
+            </w:r>
+            <w:r>
+              <w:t xml:space="preserve"> </w:t>
+            </w:r>
+            <w:r>
+              <w:t xml:space="preserve">the effect of treatment in the stratum</w:t>
+            </w:r>
+            <w:r>
+              <w:t xml:space="preserve"> </w:t>
+            </w:r>
+            <m:oMath>
+              <m:r>
+                <m:t>L</m:t>
+              </m:r>
+              <m:r>
+                <m:rPr>
+                  <m:sty m:val="p"/>
+                </m:rPr>
+                <m:t>=</m:t>
+              </m:r>
+              <m:r>
+                <m:t>l</m:t>
+              </m:r>
+            </m:oMath>
+            <w:r>
+              <w:t xml:space="preserve"> </w:t>
+            </w:r>
+            <w:r>
+              <w:t xml:space="preserve">had nobody been censored.</w:t>
+            </w:r>
+            <w:r>
+              <w:t xml:space="preserve"> </w:t>
+            </w:r>
+            <w:r>
+              <w:t xml:space="preserve">Among the diagram’s variables,</w:t>
+            </w:r>
+            <w:r>
+              <w:t xml:space="preserve"> </w:t>
+            </w:r>
+            <m:oMath>
+              <m:sSup>
+                <m:e>
+                  <m:r>
+                    <m:t>Y</m:t>
+                  </m:r>
+                </m:e>
+                <m:sup>
+                  <m:r>
+                    <m:t>a</m:t>
+                  </m:r>
+                  <m:r>
+                    <m:rPr>
+                      <m:sty m:val="p"/>
+                    </m:rPr>
+                    <m:t>,</m:t>
+                  </m:r>
+                  <m:r>
+                    <m:t>c</m:t>
+                  </m:r>
+                  <m:r>
+                    <m:rPr>
+                      <m:sty m:val="p"/>
+                    </m:rPr>
+                    <m:t>=</m:t>
+                  </m:r>
+                  <m:r>
+                    <m:t>0</m:t>
+                  </m:r>
+                </m:sup>
+              </m:sSup>
+            </m:oMath>
+            <w:r>
+              <w:t xml:space="preserve"> </w:t>
+            </w:r>
+            <w:r>
+              <w:t xml:space="preserve">is a function only of</w:t>
+            </w:r>
+            <w:r>
+              <w:t xml:space="preserve"> </w:t>
+            </w:r>
+            <m:oMath>
+              <m:r>
+                <m:t>U</m:t>
+              </m:r>
+            </m:oMath>
+            <w:r>
+              <w:t xml:space="preserve"> </w:t>
+            </w:r>
+            <w:r>
+              <w:t xml:space="preserve">(and of its own independent error),</w:t>
+            </w:r>
+            <w:r>
+              <w:t xml:space="preserve"> </w:t>
+            </w:r>
+            <w:r>
+              <w:t xml:space="preserve">and</w:t>
+            </w:r>
+            <w:r>
+              <w:t xml:space="preserve"> </w:t>
+            </w:r>
+            <m:oMath>
+              <m:r>
+                <m:t>U</m:t>
+              </m:r>
+            </m:oMath>
+            <w:r>
+              <w:t xml:space="preserve"> </w:t>
+            </w:r>
+            <w:r>
+              <w:t xml:space="preserve">is independent of</w:t>
+            </w:r>
+            <w:r>
+              <w:t xml:space="preserve"> </w:t>
+            </w:r>
+            <m:oMath>
+              <m:r>
+                <m:t>A</m:t>
+              </m:r>
+            </m:oMath>
+            <w:r>
+              <w:t xml:space="preserve"> </w:t>
+            </w:r>
+            <w:r>
+              <w:t xml:space="preserve">and</w:t>
+            </w:r>
+            <w:r>
+              <w:t xml:space="preserve"> </w:t>
+            </w:r>
+            <m:oMath>
+              <m:r>
+                <m:t>C</m:t>
+              </m:r>
+            </m:oMath>
+            <w:r>
+              <w:t xml:space="preserve"> </w:t>
+            </w:r>
+            <w:r>
+              <w:t xml:space="preserve">given</w:t>
+            </w:r>
+            <w:r>
+              <w:t xml:space="preserve"> </w:t>
+            </w:r>
+            <m:oMath>
+              <m:r>
+                <m:t>L</m:t>
+              </m:r>
+            </m:oMath>
+            <w:r>
+              <w:t xml:space="preserve">,</w:t>
+            </w:r>
+            <w:r>
+              <w:t xml:space="preserve"> </w:t>
+            </w:r>
+            <w:r>
+              <w:t xml:space="preserve">the same ratio is also the effect of treatment among the uncensored with</w:t>
+            </w:r>
+            <w:r>
+              <w:t xml:space="preserve"> </w:t>
+            </w:r>
+            <m:oMath>
+              <m:r>
+                <m:t>L</m:t>
+              </m:r>
+              <m:r>
+                <m:rPr>
+                  <m:sty m:val="p"/>
+                </m:rPr>
+                <m:t>=</m:t>
+              </m:r>
+              <m:r>
+                <m:t>l</m:t>
+              </m:r>
             </m:oMath>
             <w:r>
               <w:t xml:space="preserve">.</w:t>
@@ -17611,7 +18345,72 @@
               <w:t xml:space="preserve"> </w:t>
             </w:r>
             <w:r>
-              <w:t xml:space="preserve">For the same reason, stratification also works under Figure 8.5.</w:t>
+              <w:t xml:space="preserve">Stratification also works under Figure 8.5,</w:t>
+            </w:r>
+            <w:r>
+              <w:t xml:space="preserve"> </w:t>
+            </w:r>
+            <w:r>
+              <w:t xml:space="preserve">where treatment is not randomized,</w:t>
+            </w:r>
+            <w:r>
+              <w:t xml:space="preserve"> </w:t>
+            </w:r>
+            <w:r>
+              <w:t xml:space="preserve">because there too</w:t>
+            </w:r>
+            <w:r>
+              <w:t xml:space="preserve"> </w:t>
+            </w:r>
+            <m:oMath>
+              <m:r>
+                <m:t>U</m:t>
+              </m:r>
+            </m:oMath>
+            <w:r>
+              <w:t xml:space="preserve"> </w:t>
+            </w:r>
+            <w:r>
+              <w:t xml:space="preserve">is independent of</w:t>
+            </w:r>
+            <w:r>
+              <w:t xml:space="preserve"> </w:t>
+            </w:r>
+            <m:oMath>
+              <m:r>
+                <m:t>A</m:t>
+              </m:r>
+            </m:oMath>
+            <w:r>
+              <w:t xml:space="preserve"> </w:t>
+            </w:r>
+            <w:r>
+              <w:t xml:space="preserve">and</w:t>
+            </w:r>
+            <w:r>
+              <w:t xml:space="preserve"> </w:t>
+            </w:r>
+            <m:oMath>
+              <m:r>
+                <m:t>C</m:t>
+              </m:r>
+            </m:oMath>
+            <w:r>
+              <w:t xml:space="preserve"> </w:t>
+            </w:r>
+            <w:r>
+              <w:t xml:space="preserve">given</w:t>
+            </w:r>
+            <w:r>
+              <w:t xml:space="preserve"> </w:t>
+            </w:r>
+            <m:oMath>
+              <m:r>
+                <m:t>L</m:t>
+              </m:r>
+            </m:oMath>
+            <w:r>
+              <w:t xml:space="preserve">.</w:t>
             </w:r>
           </w:p>
           <w:bookmarkEnd w:id="73"/>

</xml_diff>